<commit_message>
Finalize ESG generated-vs-actual analysis and documentation
</commit_message>
<xml_diff>
--- a/results/Actual vs Generatet/LLM Analyse/Generated_vs_Actual_LLM_Analysis_Final.docx
+++ b/results/Actual vs Generatet/LLM Analyse/Generated_vs_Actual_LLM_Analysis_Final.docx
@@ -43,7 +43,7 @@
     </w:p>
     <w:p>
       <w:r>
-        <w:t>The closest generated-vs-actual vocabulary match is Microsoft by TF-IDF cosine similarity. The lowest match is SAP, suggesting that the generated report uses a more compressed or differently framed vocabulary than the official disclosure.</w:t>
+        <w:t>The closest generated-vs-actual vocabulary match is SAP by TF-IDF cosine similarity. The lowest match is Zalando, suggesting that the generated report uses a more compressed or differently framed vocabulary than the official disclosure.</w:t>
       </w:r>
     </w:p>
     <w:p>
@@ -290,7 +290,7 @@
                 <w:rFonts w:ascii="Calibri" w:hAnsi="Calibri"/>
                 <w:sz w:val="18"/>
               </w:rPr>
-              <w:t>0.2873</w:t>
+              <w:t>0.2874</w:t>
             </w:r>
           </w:p>
         </w:tc>
@@ -417,7 +417,7 @@
                 <w:rFonts w:ascii="Calibri" w:hAnsi="Calibri"/>
                 <w:sz w:val="18"/>
               </w:rPr>
-              <w:t>0.2954</w:t>
+              <w:t>0.2766</w:t>
             </w:r>
           </w:p>
         </w:tc>
@@ -544,7 +544,7 @@
                 <w:rFonts w:ascii="Calibri" w:hAnsi="Calibri"/>
                 <w:sz w:val="18"/>
               </w:rPr>
-              <w:t>0.2473</w:t>
+              <w:t>0.3436</w:t>
             </w:r>
           </w:p>
         </w:tc>
@@ -569,7 +569,7 @@
                 <w:rFonts w:ascii="Calibri" w:hAnsi="Calibri"/>
                 <w:sz w:val="18"/>
               </w:rPr>
-              <w:t>0.0455</w:t>
+              <w:t>0.1366</w:t>
             </w:r>
           </w:p>
         </w:tc>
@@ -594,7 +594,7 @@
                 <w:rFonts w:ascii="Calibri" w:hAnsi="Calibri"/>
                 <w:sz w:val="18"/>
               </w:rPr>
-              <w:t>0.84</w:t>
+              <w:t>22.85</w:t>
             </w:r>
           </w:p>
         </w:tc>
@@ -619,7 +619,7 @@
                 <w:rFonts w:ascii="Calibri" w:hAnsi="Calibri"/>
                 <w:sz w:val="18"/>
               </w:rPr>
-              <w:t>-65.29</w:t>
+              <w:t>2.38</w:t>
             </w:r>
           </w:p>
         </w:tc>
@@ -671,7 +671,7 @@
                 <w:rFonts w:ascii="Calibri" w:hAnsi="Calibri"/>
                 <w:sz w:val="18"/>
               </w:rPr>
-              <w:t>0.2766</w:t>
+              <w:t>0.2665</w:t>
             </w:r>
           </w:p>
         </w:tc>
@@ -770,7 +770,7 @@
     </w:p>
     <w:p>
       <w:r>
-        <w:t>The generated report has 1,061 words versus 42,256 words in the official report (2.51% of official length). Its TF-IDF cosine similarity to the official report is 0.2873, and its Jaccard similarity is 0.0615.</w:t>
+        <w:t>The generated report has 1,061 words versus 42,256 words in the official report (2.51% of official length). Its TF-IDF cosine similarity to the official report is 0.2874, and its Jaccard similarity is 0.0615.</w:t>
       </w:r>
     </w:p>
     <w:p>
@@ -816,7 +816,7 @@
     </w:p>
     <w:p>
       <w:r>
-        <w:t>The generated report has 914 words versus 39,940 words in the official report (2.29% of official length). Its TF-IDF cosine similarity to the official report is 0.2954, and its Jaccard similarity is 0.0542.</w:t>
+        <w:t>The generated report has 914 words versus 39,940 words in the official report (2.29% of official length). Its TF-IDF cosine similarity to the official report is 0.2766, and its Jaccard similarity is 0.0542.</w:t>
       </w:r>
     </w:p>
     <w:p>
@@ -862,22 +862,22 @@
     </w:p>
     <w:p>
       <w:r>
-        <w:t>The generated report has 883 words versus 105,533 words in the official report (0.84% of official length). Its TF-IDF cosine similarity to the official report is 0.2473, and its Jaccard similarity is 0.0455.</w:t>
+        <w:t>The generated report has 883 words versus 3,864 words in the official report (22.85% of official length). Its TF-IDF cosine similarity to the official report is 0.3436, and its Jaccard similarity is 0.1366.</w:t>
       </w:r>
     </w:p>
     <w:p>
       <w:r>
-        <w:t>Specificity: the generated report has 57.76 numeric mentions per 1,000 words, while the official report has 123.05. If the generated density is higher, this usually reflects concise summarization rather than a fuller evidence base; the official report still contains more total evidence.</w:t>
+        <w:t>Specificity: the generated report has 57.76 numeric mentions per 1,000 words, while the official report has 55.38. If the generated density is higher, this usually reflects concise summarization rather than a fuller evidence base; the official report still contains more total evidence.</w:t>
       </w:r>
     </w:p>
     <w:p>
       <w:r>
-        <w:t>Coverage: the generated report's strongest ESG pillar is Governance, while the official report's strongest pillar is Governance. The most prominent official-report terms that are less visible in the generated report include: board, million, cloud, revenue, executive, cash, tax, total.</w:t>
+        <w:t>Coverage: the generated report's strongest ESG pillar is Governance, while the official report's strongest pillar is Environmental. The most prominent official-report terms that are less visible in the generated report include: performance, read, growth, customers, cash, commitment, hub, key.</w:t>
       </w:r>
     </w:p>
     <w:p>
       <w:r>
-        <w:t>Framing: the generated risk-to-success ratio is 0.9, compared with 1.26 in the official report. A higher ratio indicates comparatively more attention to risks, constraints, controversies, or unresolved issues.</w:t>
+        <w:t>Framing: the generated risk-to-success ratio is 0.9, compared with 0.1 in the official report. A higher ratio indicates comparatively more attention to risks, constraints, controversies, or unresolved issues.</w:t>
       </w:r>
     </w:p>
     <w:p>
@@ -908,7 +908,7 @@
     </w:p>
     <w:p>
       <w:r>
-        <w:t>The generated report has 1,115 words versus 129,514 words in the official report (0.86% of official length). Its TF-IDF cosine similarity to the official report is 0.2766, and its Jaccard similarity is 0.0548.</w:t>
+        <w:t>The generated report has 1,115 words versus 129,514 words in the official report (0.86% of official length). Its TF-IDF cosine similarity to the official report is 0.2665, and its Jaccard similarity is 0.0548.</w:t>
       </w:r>
     </w:p>
     <w:p>

</xml_diff>